<commit_message>
api: recover legacy Daily publisher failures
</commit_message>
<xml_diff>
--- a/spec-bundle/pattern_like_astrology_app_product_platform_spec_v0.5.docx
+++ b/spec-bundle/pattern_like_astrology_app_product_platform_spec_v0.5.docx
@@ -626,7 +626,21 @@
         <w:rPr>
           <w:b w:val="0"/>
         </w:rPr>
-        <w:t>A scheduler-replaceable failure may install at most two automatic replacement commands. After the third, the reading is unavailable for that local day and the interface stops offering a control that cannot succeed.</w:t>
+        <w:t xml:space="preserve">A scheduler-replaceable failure may install at most two automatic replacement commands. After the third, the reading is unavailable for that local day and the interface stops offering a control that cannot succeed. The sole exception is transport migration: an authenticated Today request may install one generation-four successor only when the encrypted generation-three command proves that it pins the retired OpenAI transport and the current deployment is configured for Codex. The successor records </w:t>
+      </w:r>
+      <w:r>
+        <w:rPr>
+          <w:rFonts w:ascii="Consolas" w:hAnsi="Consolas"/>
+          <w:b w:val="0"/>
+          <w:sz w:val="19"/>
+        </w:rPr>
+        <w:t>publisher_superseded</w:t>
+      </w:r>
+      <w:r>
+        <w:rPr>
+          <w:b w:val="0"/>
+        </w:rPr>
+        <w:t>, and no generation-five command is permitted.</w:t>
       </w:r>
     </w:p>
     <w:p>

</xml_diff>